<commit_message>
release: publish Windows 2026.09.05.1 manual update
</commit_message>
<xml_diff>
--- a/运营管理/产品交付与宣传资料/学习悬浮助手操作手册.docx
+++ b/运营管理/产品交付与宣传资料/学习悬浮助手操作手册.docx
@@ -2081,6 +2081,116 @@
     </w:p>
     <w:p>
       <w:pPr>
+        <w:pStyle w:val="Heading2"/>
+      </w:pPr>
+      <w:r>
+        <w:t>面试过程中临时答题或 Coding</w:t>
+      </w:r>
+    </w:p>
+    <w:p>
+      <w:pPr>
+        <w:keepNext w:val="0"/>
+      </w:pPr>
+      <w:r>
+        <w:t>面试过程中临时遇到答题或手撕代码时，可以让面试助手继续听写，同时临时开启笔试助手截图搜题。切换前必须先把笔试助手调整为“悬浮框文字模式”。</w:t>
+      </w:r>
+    </w:p>
+    <w:p>
+      <w:pPr>
+        <w:keepNext w:val="0"/>
+      </w:pPr>
+      <w:r>
+        <w:t>1｜保持面试助手运行</w:t>
+      </w:r>
+    </w:p>
+    <w:p>
+      <w:pPr>
+        <w:keepNext w:val="0"/>
+      </w:pPr>
+      <w:r>
+        <w:t>Alt + R 启动的面试听写和面试悬浮框无需关闭。</w:t>
+      </w:r>
+    </w:p>
+    <w:p>
+      <w:pPr>
+        <w:keepNext w:val="0"/>
+      </w:pPr>
+      <w:r>
+        <w:t>2｜切换笔试助手模式</w:t>
+      </w:r>
+    </w:p>
+    <w:p>
+      <w:pPr>
+        <w:keepNext w:val="0"/>
+      </w:pPr>
+      <w:r>
+        <w:t>回到工作台进入笔试助手，选择“悬浮框文字模式”，不要使用语音播报模式。</w:t>
+      </w:r>
+    </w:p>
+    <w:p>
+      <w:pPr>
+        <w:keepNext w:val="0"/>
+      </w:pPr>
+      <w:r>
+        <w:t>3｜启动笔试悬浮框</w:t>
+      </w:r>
+    </w:p>
+    <w:p>
+      <w:pPr>
+        <w:keepNext w:val="0"/>
+      </w:pPr>
+      <w:r>
+        <w:t>按 Alt + B 显示笔试助手悬浮框。</w:t>
+      </w:r>
+    </w:p>
+    <w:p>
+      <w:pPr>
+        <w:keepNext w:val="0"/>
+      </w:pPr>
+      <w:r>
+        <w:t>4｜截图并搜题</w:t>
+      </w:r>
+    </w:p>
+    <w:p>
+      <w:pPr>
+        <w:keepNext w:val="0"/>
+      </w:pPr>
+      <w:r>
+        <w:t>按 Alt + Q 截图，再按 Alt + E 搜题。Coding 题同样通过截图提交，答案会显示在笔试助手悬浮框中。</w:t>
+      </w:r>
+    </w:p>
+    <w:p>
+      <w:pPr>
+        <w:keepNext w:val="0"/>
+      </w:pPr>
+      <w:r>
+        <w:t>5｜完成后关闭笔试悬浮框</w:t>
+      </w:r>
+    </w:p>
+    <w:p>
+      <w:pPr>
+        <w:keepNext w:val="0"/>
+      </w:pPr>
+      <w:r>
+        <w:t>再次按 Alt + B 隐藏笔试助手悬浮框，面试听写会继续运行；面试结束时按 Alt + R。</w:t>
+      </w:r>
+    </w:p>
+    <w:p>
+      <w:pPr>
+        <w:keepNext w:val="0"/>
+      </w:pPr>
+      <w:r>
+        <w:t>两个助手可以同时运行。后启动或最近显示的悬浮框会位于上层；位置、宽度和高度调节会作用于当前最上层的悬浮框。</w:t>
+      </w:r>
+    </w:p>
+    <w:p>
+      <w:pPr>
+        <w:keepNext w:val="0"/>
+      </w:pPr>
+      <w:r/>
+    </w:p>
+    <w:p>
+      <w:pPr>
         <w:keepNext/>
         <w:spacing w:before="0" w:after="60" w:line="300" w:lineRule="auto"/>
       </w:pPr>

</xml_diff>

<commit_message>
release: publish Windows interview voice fix 2026.09.10
</commit_message>
<xml_diff>
--- a/运营管理/产品交付与宣传资料/学习悬浮助手操作手册.docx
+++ b/运营管理/产品交付与宣传资料/学习悬浮助手操作手册.docx
@@ -2191,6 +2191,186 @@
     </w:p>
     <w:p>
       <w:pPr>
+        <w:pStyle w:val="Heading2"/>
+      </w:pPr>
+      <w:r>
+        <w:t>长语音面试与失败重试</w:t>
+      </w:r>
+    </w:p>
+    <w:p>
+      <w:pPr>
+        <w:keepNext w:val="0"/>
+      </w:pPr>
+      <w:r>
+        <w:t>Windows 面试助手会把同一轮连续语音的多个识别片段合并后再提交。中间片段出现句号或问号时不会立即拆成多个 AI 请求；在静音、停止听写或重连时，系统会提交最后一段完整问题。</w:t>
+      </w:r>
+    </w:p>
+    <w:p>
+      <w:pPr>
+        <w:keepNext w:val="0"/>
+      </w:pPr>
+      <w:r>
+        <w:t>1｜长问题只提交一次</w:t>
+      </w:r>
+    </w:p>
+    <w:p>
+      <w:pPr>
+        <w:keepNext w:val="0"/>
+      </w:pPr>
+      <w:r>
+        <w:t>说完一个较长问题后留出短暂静音，左侧只应出现一张问题卡并生成一次回答。</w:t>
+      </w:r>
+    </w:p>
+    <w:p>
+      <w:pPr>
+        <w:keepNext w:val="0"/>
+      </w:pPr>
+      <w:r>
+        <w:t>2｜超长上下文自动压缩</w:t>
+      </w:r>
+    </w:p>
+    <w:p>
+      <w:pPr>
+        <w:keepNext w:val="0"/>
+      </w:pPr>
+      <w:r>
+        <w:t>岗位描述、简历和历史面试内容过长时，客户端会保留关键信息并压缩请求上下文，减少 AI 输入过大或超时。</w:t>
+      </w:r>
+    </w:p>
+    <w:p>
+      <w:pPr>
+        <w:keepNext w:val="0"/>
+      </w:pPr>
+      <w:r>
+        <w:t>3｜失败后重试</w:t>
+      </w:r>
+    </w:p>
+    <w:p>
+      <w:pPr>
+        <w:keepNext w:val="0"/>
+      </w:pPr>
+      <w:r>
+        <w:t>网络失败时可重试当前问题。重复识别片段不会重复创建任务或重复扣费。</w:t>
+      </w:r>
+    </w:p>
+    <w:p>
+      <w:pPr>
+        <w:keepNext w:val="0"/>
+      </w:pPr>
+      <w:r/>
+    </w:p>
+    <w:p>
+      <w:pPr>
+        <w:pStyle w:val="Heading2"/>
+      </w:pPr>
+      <w:r>
+        <w:t>面试过程中临时答题或 Coding</w:t>
+      </w:r>
+    </w:p>
+    <w:p>
+      <w:pPr>
+        <w:keepNext w:val="0"/>
+      </w:pPr>
+      <w:r>
+        <w:t>面试过程中临时遇到答题或手撕代码时，可以让面试助手继续听写，同时临时开启笔试助手截图搜题。切换前必须先把笔试助手调整为“悬浮框文字模式”。</w:t>
+      </w:r>
+    </w:p>
+    <w:p>
+      <w:pPr>
+        <w:keepNext w:val="0"/>
+      </w:pPr>
+      <w:r>
+        <w:t>1｜保持面试助手运行</w:t>
+      </w:r>
+    </w:p>
+    <w:p>
+      <w:pPr>
+        <w:keepNext w:val="0"/>
+      </w:pPr>
+      <w:r>
+        <w:t>Alt + R 启动的面试听写和面试悬浮框无需关闭。</w:t>
+      </w:r>
+    </w:p>
+    <w:p>
+      <w:pPr>
+        <w:keepNext w:val="0"/>
+      </w:pPr>
+      <w:r>
+        <w:t>2｜切换笔试助手模式</w:t>
+      </w:r>
+    </w:p>
+    <w:p>
+      <w:pPr>
+        <w:keepNext w:val="0"/>
+      </w:pPr>
+      <w:r>
+        <w:t>回到工作台进入笔试助手，选择“悬浮框文字模式”，不要使用语音播报模式。</w:t>
+      </w:r>
+    </w:p>
+    <w:p>
+      <w:pPr>
+        <w:keepNext w:val="0"/>
+      </w:pPr>
+      <w:r>
+        <w:t>3｜启动笔试悬浮框</w:t>
+      </w:r>
+    </w:p>
+    <w:p>
+      <w:pPr>
+        <w:keepNext w:val="0"/>
+      </w:pPr>
+      <w:r>
+        <w:t>按 Alt + B 显示笔试助手悬浮框。</w:t>
+      </w:r>
+    </w:p>
+    <w:p>
+      <w:pPr>
+        <w:keepNext w:val="0"/>
+      </w:pPr>
+      <w:r>
+        <w:t>4｜截图并搜题</w:t>
+      </w:r>
+    </w:p>
+    <w:p>
+      <w:pPr>
+        <w:keepNext w:val="0"/>
+      </w:pPr>
+      <w:r>
+        <w:t>按 Alt + Q 截图，再按 Alt + E 搜题。Coding 题同样通过截图提交，答案会显示在笔试助手悬浮框中。</w:t>
+      </w:r>
+    </w:p>
+    <w:p>
+      <w:pPr>
+        <w:keepNext w:val="0"/>
+      </w:pPr>
+      <w:r>
+        <w:t>5｜完成后关闭笔试悬浮框</w:t>
+      </w:r>
+    </w:p>
+    <w:p>
+      <w:pPr>
+        <w:keepNext w:val="0"/>
+      </w:pPr>
+      <w:r>
+        <w:t>再次按 Alt + B 隐藏笔试助手悬浮框，面试听写会继续运行；面试结束时按 Alt + R。</w:t>
+      </w:r>
+    </w:p>
+    <w:p>
+      <w:pPr>
+        <w:keepNext w:val="0"/>
+      </w:pPr>
+      <w:r>
+        <w:t>两个助手可以同时运行。后启动或最近显示的悬浮框会位于上层；位置、宽度和高度调节会作用于当前最上层的悬浮框。</w:t>
+      </w:r>
+    </w:p>
+    <w:p>
+      <w:pPr>
+        <w:keepNext w:val="0"/>
+      </w:pPr>
+      <w:r/>
+    </w:p>
+    <w:p>
+      <w:pPr>
         <w:keepNext/>
         <w:spacing w:before="0" w:after="60" w:line="300" w:lineRule="auto"/>
       </w:pPr>

</xml_diff>

<commit_message>
release: publish mac companion 2026.09.12
</commit_message>
<xml_diff>
--- a/运营管理/产品交付与宣传资料/学习悬浮助手操作手册.docx
+++ b/运营管理/产品交付与宣传资料/学习悬浮助手操作手册.docx
@@ -3580,6 +3580,110 @@
         <w:t>客户端 UI、账号流程、权限或安装包发生变化时，应重新采集对应平台截图，更新操作步骤，并按照《多个版本的客户端的测试文档》执行回归和回滚验证。</w:t>
       </w:r>
     </w:p>
+    <w:p>
+      <w:pPr>
+        <w:pStyle w:val="Heading1"/>
+        <w:keepNext/>
+      </w:pPr>
+      <w:r>
+        <w:t>Mac 双机协作补充（2026.09.12）</w:t>
+      </w:r>
+    </w:p>
+    <w:p>
+      <w:r>
+        <w:t>本节适用于 Mac 客户端双机协作笔试与面试。开始前请确认客户端已登录，手机和 Mac 均能访问网络。</w:t>
+      </w:r>
+    </w:p>
+    <w:p>
+      <w:pPr>
+        <w:pStyle w:val="Heading2"/>
+      </w:pPr>
+      <w:r>
+        <w:t>一、配对与工作区</w:t>
+      </w:r>
+    </w:p>
+    <w:p>
+      <w:pPr>
+        <w:pStyle w:val="ListBullet"/>
+      </w:pPr>
+      <w:r>
+        <w:t>在 Mac 客户端选择“ 双机协作 ”入口，页面会同时显示二维码和 6 位连接码。用手机扫描二维码，或在手机配对页输入 6 位连接码。</w:t>
+      </w:r>
+    </w:p>
+    <w:p>
+      <w:pPr>
+        <w:pStyle w:val="ListBullet"/>
+      </w:pPr>
+      <w:r>
+        <w:t>配对成功后，手机端可以进行三张截图搜题；题目、答案和任务状态会同步回 Mac。连续截图请等待上一题状态稳定后再继续。</w:t>
+      </w:r>
+    </w:p>
+    <w:p>
+      <w:pPr>
+        <w:pStyle w:val="ListBullet"/>
+      </w:pPr>
+      <w:r>
+        <w:t>手机面试需要在手机端点击“开始面试”。演示模式使用麦克风和电脑声音；正式模式仅使用电脑声音。</w:t>
+      </w:r>
+    </w:p>
+    <w:p>
+      <w:pPr>
+        <w:pStyle w:val="ListBullet"/>
+      </w:pPr>
+      <w:r>
+        <w:t>切回 PC 工作区前，先停止双机协作并确认手机端退出；退出账号时按页面提示清理配对会话，避免下次打开仍显示旧连接。</w:t>
+      </w:r>
+    </w:p>
+    <w:p>
+      <w:pPr>
+        <w:pStyle w:val="Heading2"/>
+      </w:pPr>
+      <w:r>
+        <w:t>二、Mac 系统权限</w:t>
+      </w:r>
+    </w:p>
+    <w:p>
+      <w:pPr>
+        <w:pStyle w:val="ListBullet"/>
+      </w:pPr>
+      <w:r>
+        <w:t>首次使用时，在“系统设置 → 隐私与安全性 → 屏幕录制”中允许 QuizMate；需要语音时同时允许“麦克风”和“系统音频/电脑声音”（不同 macOS 版本名称可能略有差异）。</w:t>
+      </w:r>
+    </w:p>
+    <w:p>
+      <w:pPr>
+        <w:pStyle w:val="ListBullet"/>
+      </w:pPr>
+      <w:r>
+        <w:t>授权后完全退出并重新打开 QuizMate，再进入双机协作或面试页面。若权限状态仍为未授权，请关闭客户端后重新检查对应开关。</w:t>
+      </w:r>
+    </w:p>
+    <w:p>
+      <w:pPr>
+        <w:pStyle w:val="ListBullet"/>
+      </w:pPr>
+      <w:r>
+        <w:t>二维码无法使用时可改用 6 位连接码；连接码过期则返回客户端重新生成，不要复用旧码。</w:t>
+      </w:r>
+    </w:p>
+    <w:p>
+      <w:pPr>
+        <w:pStyle w:val="Heading2"/>
+      </w:pPr>
+      <w:r>
+        <w:t>三、常见问题</w:t>
+      </w:r>
+    </w:p>
+    <w:p>
+      <w:r>
+        <w:t>手机没有收到题目：确认配对状态为已连接，检查网络和屏幕录制权限后重新生成连接码。答案未更新时不要重复扣费，先点击刷新或重新连接并等待当前任务完成。</w:t>
+      </w:r>
+    </w:p>
+    <w:p>
+      <w:r>
+        <w:t>文档版本：2026.09.12</w:t>
+      </w:r>
+    </w:p>
     <w:sectPr>
       <w:headerReference w:type="default" r:id="rId9"/>
       <w:footerReference w:type="default" r:id="rId10"/>

</xml_diff>